<commit_message>
Ajoute les noms complets de l'équipe
Co-Authored-By: Claude Opus 5.5 <noreply@anthropic.com>
Claude-Session: https://claude.ai/code/session_01QTFeQ3stJTsA9FrdN3jTWC
</commit_message>
<xml_diff>
--- a/strategie/04_Strategie_Initiale_Equipe3_Sainplement.docx
+++ b/strategie/04_Strategie_Initiale_Equipe3_Sainplement.docx
@@ -389,7 +389,7 @@
               <w:rPr>
                 <w:b w:val="0"/>
               </w:rPr>
-              <w:t>Titouan</w:t>
+              <w:t>Titouan POUGNEAUD</w:t>
             </w:r>
           </w:p>
         </w:tc>
@@ -453,7 +453,7 @@
               <w:rPr>
                 <w:b w:val="0"/>
               </w:rPr>
-              <w:t>Romain</w:t>
+              <w:t>Romain BEAUDOIN</w:t>
             </w:r>
           </w:p>
         </w:tc>
@@ -513,7 +513,7 @@
               <w:rPr>
                 <w:b w:val="0"/>
               </w:rPr>
-              <w:t>Yasmine</w:t>
+              <w:t>Yasmine ZAITER</w:t>
             </w:r>
           </w:p>
         </w:tc>
@@ -573,7 +573,7 @@
               <w:rPr>
                 <w:b w:val="0"/>
               </w:rPr>
-              <w:t>Lou</w:t>
+              <w:t>Lou LESNE</w:t>
             </w:r>
           </w:p>
         </w:tc>

</xml_diff>